<commit_message>
form v18: remove blank pages (sections flow continuously), trim 5 duplicate lines
Co-Authored-By: Claude Opus 5.5 <noreply@anthropic.com>
Claude-Session: https://claude.ai/code/session_011J2KrGUp2npQo9Tosx1KRc
</commit_message>
<xml_diff>
--- a/docs/qacrs/form_drafts/IBDAA_2027_FORM_ACRS_v18.docx
+++ b/docs/qacrs/form_drafts/IBDAA_2027_FORM_ACRS_v18.docx
@@ -3363,27 +3363,6 @@
         </w:tc>
       </w:tr>
     </w:tbl>
-    <w:p>
-      <w:pPr>
-        <w:spacing w:after="200"/>
-        <w:rPr>
-          <w:rFonts w:ascii="Vazirmatn" w:hAnsi="Vazirmatn" w:cs="Vazirmatn"/>
-        </w:rPr>
-      </w:pPr>
-    </w:p>
-    <w:p>
-      <w:pPr>
-        <w:rPr>
-          <w:rFonts w:ascii="Vazirmatn" w:hAnsi="Vazirmatn" w:cs="Vazirmatn"/>
-        </w:rPr>
-      </w:pPr>
-      <w:r>
-        <w:rPr>
-          <w:rFonts w:ascii="Vazirmatn" w:hAnsi="Vazirmatn" w:cs="Vazirmatn" w:hint="cs"/>
-        </w:rPr>
-        <w:br w:type="page"/>
-      </w:r>
-    </w:p>
     <w:tbl>
       <w:tblPr>
         <w:tblW w:w="9746" w:type="dxa"/>
@@ -3431,6 +3410,7 @@
           </w:tcPr>
           <w:p>
             <w:pPr>
+              <w:pageBreakBefore/>
               <w:spacing w:line="260" w:lineRule="auto"/>
               <w:rPr>
                 <w:rFonts w:ascii="Vazirmatn" w:hAnsi="Vazirmatn" w:cs="Vazirmatn"/>
@@ -3854,7 +3834,8 @@
           <w:p>
             <w:pPr>
               <w:bidi/>
-              <w:spacing w:after="100" w:line="300" w:lineRule="auto"/>
+              <w:spacing w:after="60" w:line="300" w:lineRule="auto"/>
+              <w:ind w:start="340" w:hanging="340"/>
               <w:jc w:val="both"/>
               <w:rPr>
                 <w:rFonts w:ascii="Arial" w:hAnsi="Arial" w:cs="Arial"/>
@@ -3866,13 +3847,113 @@
             <w:r>
               <w:rPr>
                 <w:rFonts w:ascii="Arial" w:hAnsi="Arial" w:cs="Arial"/>
-                <w:b/>
-                <w:bCs/>
-                <w:sz w:val="22"/>
-                <w:szCs w:val="22"/>
-                <w:rtl/>
-              </w:rPr>
-              <w:t xml:space="preserve">الدليل على أن المشكلة حقيقية:</w:t>
+                <w:sz w:val="22"/>
+                <w:szCs w:val="22"/>
+                <w:rtl/>
+              </w:rPr>
+              <w:t xml:space="preserve">–  اكتشفنا أن النظام قد يتعطل دون أن يصله الهجوم أصلًا؛ ففي هجوم </w:t>
+            </w:r>
+            <w:r>
+              <w:rPr>
+                <w:rFonts w:ascii="Arial" w:hAnsi="Arial" w:cs="Arial"/>
+                <w:sz w:val="22"/>
+                <w:szCs w:val="22"/>
+              </w:rPr>
+              <w:t xml:space="preserve">WannaCry</w:t>
+            </w:r>
+            <w:r>
+              <w:rPr>
+                <w:rFonts w:ascii="Arial" w:hAnsi="Arial" w:cs="Arial"/>
+                <w:sz w:val="22"/>
+                <w:szCs w:val="22"/>
+                <w:rtl/>
+              </w:rPr>
+              <w:t xml:space="preserve"> على النظام الصحي البريطاني عام </w:t>
+            </w:r>
+            <w:r>
+              <w:rPr>
+                <w:rFonts w:ascii="Arial" w:hAnsi="Arial" w:cs="Arial"/>
+                <w:sz w:val="22"/>
+                <w:szCs w:val="22"/>
+              </w:rPr>
+              <w:t xml:space="preserve">2017</w:t>
+            </w:r>
+            <w:r>
+              <w:rPr>
+                <w:rFonts w:ascii="Arial" w:hAnsi="Arial" w:cs="Arial"/>
+                <w:sz w:val="22"/>
+                <w:szCs w:val="22"/>
+                <w:rtl/>
+              </w:rPr>
+              <w:t xml:space="preserve"> تأثرت </w:t>
+            </w:r>
+            <w:r>
+              <w:rPr>
+                <w:rFonts w:ascii="Arial" w:hAnsi="Arial" w:cs="Arial"/>
+                <w:sz w:val="22"/>
+                <w:szCs w:val="22"/>
+              </w:rPr>
+              <w:t xml:space="preserve">80</w:t>
+            </w:r>
+            <w:r>
+              <w:rPr>
+                <w:rFonts w:ascii="Arial" w:hAnsi="Arial" w:cs="Arial"/>
+                <w:sz w:val="22"/>
+                <w:szCs w:val="22"/>
+                <w:rtl/>
+              </w:rPr>
+              <w:t xml:space="preserve"> جهة صحية، منها </w:t>
+            </w:r>
+            <w:r>
+              <w:rPr>
+                <w:rFonts w:ascii="Arial" w:hAnsi="Arial" w:cs="Arial"/>
+                <w:sz w:val="22"/>
+                <w:szCs w:val="22"/>
+              </w:rPr>
+              <w:t xml:space="preserve">46</w:t>
+            </w:r>
+            <w:r>
+              <w:rPr>
+                <w:rFonts w:ascii="Arial" w:hAnsi="Arial" w:cs="Arial"/>
+                <w:sz w:val="22"/>
+                <w:szCs w:val="22"/>
+                <w:rtl/>
+              </w:rPr>
+              <w:t xml:space="preserve"> جهة لم تكن مصابة لكنها فصلت أنظمتها احتياطًا، وأُلغي نحو </w:t>
+            </w:r>
+            <w:r>
+              <w:rPr>
+                <w:rFonts w:ascii="Arial" w:hAnsi="Arial" w:cs="Arial"/>
+                <w:sz w:val="22"/>
+                <w:szCs w:val="22"/>
+              </w:rPr>
+              <w:t xml:space="preserve">19,000</w:t>
+            </w:r>
+            <w:r>
+              <w:rPr>
+                <w:rFonts w:ascii="Arial" w:hAnsi="Arial" w:cs="Arial"/>
+                <w:sz w:val="22"/>
+                <w:szCs w:val="22"/>
+                <w:rtl/>
+              </w:rPr>
+              <w:t xml:space="preserve"> موعد طبي </w:t>
+            </w:r>
+            <w:r>
+              <w:rPr>
+                <w:rFonts w:ascii="Arial" w:hAnsi="Arial" w:cs="Arial"/>
+                <w:sz w:val="22"/>
+                <w:szCs w:val="22"/>
+              </w:rPr>
+              <w:t xml:space="preserve">[1]</w:t>
+            </w:r>
+            <w:r>
+              <w:rPr>
+                <w:rFonts w:ascii="Arial" w:hAnsi="Arial" w:cs="Arial"/>
+                <w:sz w:val="22"/>
+                <w:szCs w:val="22"/>
+                <w:rtl/>
+              </w:rPr>
+              <w:t xml:space="preserve">. أي أن جزءًا كبيرًا من الضرر جاء من ردة الفعل لا من الهجوم نفسه.</w:t>
             </w:r>
           </w:p>
           <w:p>
@@ -3895,131 +3976,6 @@
                 <w:szCs w:val="22"/>
                 <w:rtl/>
               </w:rPr>
-              <w:t xml:space="preserve">–  اكتشفنا أن النظام قد يتعطل دون أن يصله الهجوم أصلًا؛ ففي هجوم </w:t>
-            </w:r>
-            <w:r>
-              <w:rPr>
-                <w:rFonts w:ascii="Arial" w:hAnsi="Arial" w:cs="Arial"/>
-                <w:sz w:val="22"/>
-                <w:szCs w:val="22"/>
-              </w:rPr>
-              <w:t xml:space="preserve">WannaCry</w:t>
-            </w:r>
-            <w:r>
-              <w:rPr>
-                <w:rFonts w:ascii="Arial" w:hAnsi="Arial" w:cs="Arial"/>
-                <w:sz w:val="22"/>
-                <w:szCs w:val="22"/>
-                <w:rtl/>
-              </w:rPr>
-              <w:t xml:space="preserve"> على النظام الصحي البريطاني عام </w:t>
-            </w:r>
-            <w:r>
-              <w:rPr>
-                <w:rFonts w:ascii="Arial" w:hAnsi="Arial" w:cs="Arial"/>
-                <w:sz w:val="22"/>
-                <w:szCs w:val="22"/>
-              </w:rPr>
-              <w:t xml:space="preserve">2017</w:t>
-            </w:r>
-            <w:r>
-              <w:rPr>
-                <w:rFonts w:ascii="Arial" w:hAnsi="Arial" w:cs="Arial"/>
-                <w:sz w:val="22"/>
-                <w:szCs w:val="22"/>
-                <w:rtl/>
-              </w:rPr>
-              <w:t xml:space="preserve"> تأثرت </w:t>
-            </w:r>
-            <w:r>
-              <w:rPr>
-                <w:rFonts w:ascii="Arial" w:hAnsi="Arial" w:cs="Arial"/>
-                <w:sz w:val="22"/>
-                <w:szCs w:val="22"/>
-              </w:rPr>
-              <w:t xml:space="preserve">80</w:t>
-            </w:r>
-            <w:r>
-              <w:rPr>
-                <w:rFonts w:ascii="Arial" w:hAnsi="Arial" w:cs="Arial"/>
-                <w:sz w:val="22"/>
-                <w:szCs w:val="22"/>
-                <w:rtl/>
-              </w:rPr>
-              <w:t xml:space="preserve"> جهة صحية، منها </w:t>
-            </w:r>
-            <w:r>
-              <w:rPr>
-                <w:rFonts w:ascii="Arial" w:hAnsi="Arial" w:cs="Arial"/>
-                <w:sz w:val="22"/>
-                <w:szCs w:val="22"/>
-              </w:rPr>
-              <w:t xml:space="preserve">46</w:t>
-            </w:r>
-            <w:r>
-              <w:rPr>
-                <w:rFonts w:ascii="Arial" w:hAnsi="Arial" w:cs="Arial"/>
-                <w:sz w:val="22"/>
-                <w:szCs w:val="22"/>
-                <w:rtl/>
-              </w:rPr>
-              <w:t xml:space="preserve"> جهة لم تكن مصابة لكنها فصلت أنظمتها احتياطًا، وأُلغي نحو </w:t>
-            </w:r>
-            <w:r>
-              <w:rPr>
-                <w:rFonts w:ascii="Arial" w:hAnsi="Arial" w:cs="Arial"/>
-                <w:sz w:val="22"/>
-                <w:szCs w:val="22"/>
-              </w:rPr>
-              <w:t xml:space="preserve">19,000</w:t>
-            </w:r>
-            <w:r>
-              <w:rPr>
-                <w:rFonts w:ascii="Arial" w:hAnsi="Arial" w:cs="Arial"/>
-                <w:sz w:val="22"/>
-                <w:szCs w:val="22"/>
-                <w:rtl/>
-              </w:rPr>
-              <w:t xml:space="preserve"> موعد طبي </w:t>
-            </w:r>
-            <w:r>
-              <w:rPr>
-                <w:rFonts w:ascii="Arial" w:hAnsi="Arial" w:cs="Arial"/>
-                <w:sz w:val="22"/>
-                <w:szCs w:val="22"/>
-              </w:rPr>
-              <w:t xml:space="preserve">[1]</w:t>
-            </w:r>
-            <w:r>
-              <w:rPr>
-                <w:rFonts w:ascii="Arial" w:hAnsi="Arial" w:cs="Arial"/>
-                <w:sz w:val="22"/>
-                <w:szCs w:val="22"/>
-                <w:rtl/>
-              </w:rPr>
-              <w:t xml:space="preserve">. أي أن جزءًا كبيرًا من الضرر جاء من ردة الفعل لا من الهجوم نفسه.</w:t>
-            </w:r>
-          </w:p>
-          <w:p>
-            <w:pPr>
-              <w:bidi/>
-              <w:spacing w:after="60" w:line="300" w:lineRule="auto"/>
-              <w:ind w:start="340" w:hanging="340"/>
-              <w:jc w:val="both"/>
-              <w:rPr>
-                <w:rFonts w:ascii="Arial" w:hAnsi="Arial" w:cs="Arial"/>
-                <w:sz w:val="22"/>
-                <w:szCs w:val="22"/>
-                <w:rtl/>
-              </w:rPr>
-            </w:pPr>
-            <w:r>
-              <w:rPr>
-                <w:rFonts w:ascii="Arial" w:hAnsi="Arial" w:cs="Arial"/>
-                <w:sz w:val="22"/>
-                <w:szCs w:val="22"/>
-                <w:rtl/>
-              </w:rPr>
               <w:t xml:space="preserve">–  وتكرر ذلك في هجوم الفدية على </w:t>
             </w:r>
             <w:r>
@@ -4341,7 +4297,7 @@
                 <w:szCs w:val="22"/>
                 <w:rtl/>
               </w:rPr>
-              <w:t xml:space="preserve"> بل يجزّئه: يُبقي اتصالاته الضرورية ويقطع طرق المهاجم فقط، ويحيل القرار لموافقة الشخص المسؤول قبل أي إجراء أشد.</w:t>
+              <w:t xml:space="preserve"> بل يجزّئه: يُبقي اتصالاته الضرورية ويقطع طرق المهاجم فقط.</w:t>
             </w:r>
           </w:p>
           <w:p>
@@ -4365,39 +4321,6 @@
                 <w:szCs w:val="22"/>
                 <w:rtl/>
               </w:rPr>
-              <w:t xml:space="preserve">المتأثرون:</w:t>
-            </w:r>
-            <w:r>
-              <w:rPr>
-                <w:rFonts w:ascii="Arial" w:hAnsi="Arial" w:cs="Arial"/>
-                <w:sz w:val="22"/>
-                <w:szCs w:val="22"/>
-                <w:rtl/>
-              </w:rPr>
-              <w:t xml:space="preserve"> المستفيدون من الخدمات الحيوية، كالمرضى وعملاء البنوك والحجاج، والموظفون الذين يفقدون أنظمتهم، وفرق الأمن التي تقرر العزل تحت ضغط الوقت.</w:t>
-            </w:r>
-          </w:p>
-          <w:p>
-            <w:pPr>
-              <w:bidi/>
-              <w:spacing w:after="100" w:line="300" w:lineRule="auto"/>
-              <w:jc w:val="both"/>
-              <w:rPr>
-                <w:rFonts w:ascii="Arial" w:hAnsi="Arial" w:cs="Arial"/>
-                <w:sz w:val="22"/>
-                <w:szCs w:val="22"/>
-                <w:rtl/>
-              </w:rPr>
-            </w:pPr>
-            <w:r>
-              <w:rPr>
-                <w:rFonts w:ascii="Arial" w:hAnsi="Arial" w:cs="Arial"/>
-                <w:b/>
-                <w:bCs/>
-                <w:sz w:val="22"/>
-                <w:szCs w:val="22"/>
-                <w:rtl/>
-              </w:rPr>
               <w:t xml:space="preserve">سؤال البحث:</w:t>
             </w:r>
             <w:r>
@@ -4413,27 +4336,6 @@
         </w:tc>
       </w:tr>
     </w:tbl>
-    <w:p>
-      <w:pPr>
-        <w:spacing w:after="200"/>
-        <w:rPr>
-          <w:rFonts w:ascii="Vazirmatn" w:hAnsi="Vazirmatn" w:cs="Vazirmatn"/>
-        </w:rPr>
-      </w:pPr>
-    </w:p>
-    <w:p>
-      <w:pPr>
-        <w:rPr>
-          <w:rFonts w:ascii="Vazirmatn" w:hAnsi="Vazirmatn" w:cs="Vazirmatn"/>
-        </w:rPr>
-      </w:pPr>
-      <w:r>
-        <w:rPr>
-          <w:rFonts w:ascii="Vazirmatn" w:hAnsi="Vazirmatn" w:cs="Vazirmatn" w:hint="cs"/>
-        </w:rPr>
-        <w:br w:type="page"/>
-      </w:r>
-    </w:p>
     <w:tbl>
       <w:tblPr>
         <w:tblW w:w="9746" w:type="dxa"/>
@@ -4481,6 +4383,7 @@
           </w:tcPr>
           <w:p>
             <w:pPr>
+              <w:pageBreakBefore/>
               <w:spacing w:line="260" w:lineRule="auto"/>
               <w:rPr>
                 <w:rFonts w:ascii="Vazirmatn" w:hAnsi="Vazirmatn" w:cs="Vazirmatn"/>
@@ -5450,57 +5353,6 @@
                 <w:szCs w:val="22"/>
                 <w:rtl/>
               </w:rPr>
-              <w:t xml:space="preserve">، وقد شغّلها </w:t>
-            </w:r>
-            <w:r>
-              <w:rPr>
-                <w:rFonts w:ascii="Arial" w:hAnsi="Arial" w:cs="Arial"/>
-                <w:sz w:val="22"/>
-                <w:szCs w:val="22"/>
-              </w:rPr>
-              <w:t xml:space="preserve">Cogburn</w:t>
-            </w:r>
-            <w:r>
-              <w:rPr>
-                <w:rFonts w:ascii="Arial" w:hAnsi="Arial" w:cs="Arial"/>
-                <w:sz w:val="22"/>
-                <w:szCs w:val="22"/>
-                <w:rtl/>
-              </w:rPr>
-              <w:t xml:space="preserve"> وزملاؤه على حواسيب </w:t>
-            </w:r>
-            <w:r>
-              <w:rPr>
-                <w:rFonts w:ascii="Arial" w:hAnsi="Arial" w:cs="Arial"/>
-                <w:sz w:val="22"/>
-                <w:szCs w:val="22"/>
-              </w:rPr>
-              <w:t xml:space="preserve">IBM</w:t>
-            </w:r>
-            <w:r>
-              <w:rPr>
-                <w:rFonts w:ascii="Arial" w:hAnsi="Arial" w:cs="Arial"/>
-                <w:sz w:val="22"/>
-                <w:szCs w:val="22"/>
-                <w:rtl/>
-              </w:rPr>
-              <w:t xml:space="preserve"> لفصل حركة الهجوم عن الحركة السليمة، لكن دون بوابة سلامة </w:t>
-            </w:r>
-            <w:r>
-              <w:rPr>
-                <w:rFonts w:ascii="Arial" w:hAnsi="Arial" w:cs="Arial"/>
-                <w:sz w:val="22"/>
-                <w:szCs w:val="22"/>
-              </w:rPr>
-              <w:t xml:space="preserve">[18]</w:t>
-            </w:r>
-            <w:r>
-              <w:rPr>
-                <w:rFonts w:ascii="Arial" w:hAnsi="Arial" w:cs="Arial"/>
-                <w:sz w:val="22"/>
-                <w:szCs w:val="22"/>
-                <w:rtl/>
-              </w:rPr>
               <w:t xml:space="preserve">.</w:t>
             </w:r>
           </w:p>
@@ -5580,7 +5432,7 @@
                 <w:sz w:val="22"/>
                 <w:szCs w:val="22"/>
               </w:rPr>
-              <w:t xml:space="preserve">Simplex [19]</w:t>
+              <w:t xml:space="preserve">Simplex [18]</w:t>
             </w:r>
             <w:r>
               <w:rPr>
@@ -5614,7 +5466,7 @@
                 <w:sz w:val="22"/>
                 <w:szCs w:val="22"/>
               </w:rPr>
-              <w:t xml:space="preserve">Z3 [20]</w:t>
+              <w:t xml:space="preserve">Z3 [19]</w:t>
             </w:r>
             <w:r>
               <w:rPr>
@@ -5631,125 +5483,7 @@
                 <w:sz w:val="22"/>
                 <w:szCs w:val="22"/>
               </w:rPr>
-              <w:t xml:space="preserve">HiGHS [21]</w:t>
-            </w:r>
-            <w:r>
-              <w:rPr>
-                <w:rFonts w:ascii="Arial" w:hAnsi="Arial" w:cs="Arial"/>
-                <w:sz w:val="22"/>
-                <w:szCs w:val="22"/>
-                <w:rtl/>
-              </w:rPr>
-              <w:t xml:space="preserve">.</w:t>
-            </w:r>
-          </w:p>
-          <w:p>
-            <w:pPr>
-              <w:bidi/>
-              <w:spacing w:after="100" w:line="300" w:lineRule="auto"/>
-              <w:jc w:val="both"/>
-              <w:rPr>
-                <w:rFonts w:ascii="Arial" w:hAnsi="Arial" w:cs="Arial"/>
-                <w:sz w:val="22"/>
-                <w:szCs w:val="22"/>
-                <w:rtl/>
-              </w:rPr>
-            </w:pPr>
-            <w:r>
-              <w:rPr>
-                <w:rFonts w:ascii="Arial" w:hAnsi="Arial" w:cs="Arial"/>
-                <w:b/>
-                <w:bCs/>
-                <w:sz w:val="22"/>
-                <w:szCs w:val="22"/>
-                <w:rtl/>
-              </w:rPr>
-              <w:t xml:space="preserve">أولوية التوفر.</w:t>
-            </w:r>
-            <w:r>
-              <w:rPr>
-                <w:rFonts w:ascii="Arial" w:hAnsi="Arial" w:cs="Arial"/>
-                <w:sz w:val="22"/>
-                <w:szCs w:val="22"/>
-                <w:rtl/>
-              </w:rPr>
-              <w:t xml:space="preserve"> ويضع دليل </w:t>
-            </w:r>
-            <w:r>
-              <w:rPr>
-                <w:rFonts w:ascii="Arial" w:hAnsi="Arial" w:cs="Arial"/>
-                <w:sz w:val="22"/>
-                <w:szCs w:val="22"/>
-              </w:rPr>
-              <w:t xml:space="preserve">NIST</w:t>
-            </w:r>
-            <w:r>
-              <w:rPr>
-                <w:rFonts w:ascii="Arial" w:hAnsi="Arial" w:cs="Arial"/>
-                <w:sz w:val="22"/>
-                <w:szCs w:val="22"/>
-                <w:rtl/>
-              </w:rPr>
-              <w:t xml:space="preserve"> لأمن الأنظمة التشغيلية التوفر وسلامة العمليات في مقدمة الأهداف </w:t>
-            </w:r>
-            <w:r>
-              <w:rPr>
-                <w:rFonts w:ascii="Arial" w:hAnsi="Arial" w:cs="Arial"/>
-                <w:sz w:val="22"/>
-                <w:szCs w:val="22"/>
-              </w:rPr>
-              <w:t xml:space="preserve">[22]</w:t>
-            </w:r>
-            <w:r>
-              <w:rPr>
-                <w:rFonts w:ascii="Arial" w:hAnsi="Arial" w:cs="Arial"/>
-                <w:sz w:val="22"/>
-                <w:szCs w:val="22"/>
-                <w:rtl/>
-              </w:rPr>
-              <w:t xml:space="preserve">، وهذا ما يجعل العزل الشامل خيارًا مكلفًا. واعتمدنا في تعريف «الخطورة العالية» على مقياس </w:t>
-            </w:r>
-            <w:r>
-              <w:rPr>
-                <w:rFonts w:ascii="Arial" w:hAnsi="Arial" w:cs="Arial"/>
-                <w:sz w:val="22"/>
-                <w:szCs w:val="22"/>
-              </w:rPr>
-              <w:t xml:space="preserve">CVSS v3.1</w:t>
-            </w:r>
-            <w:r>
-              <w:rPr>
-                <w:rFonts w:ascii="Arial" w:hAnsi="Arial" w:cs="Arial"/>
-                <w:sz w:val="22"/>
-                <w:szCs w:val="22"/>
-                <w:rtl/>
-              </w:rPr>
-              <w:t xml:space="preserve"> (تبدأ فئة </w:t>
-            </w:r>
-            <w:r>
-              <w:rPr>
-                <w:rFonts w:ascii="Arial" w:hAnsi="Arial" w:cs="Arial"/>
-                <w:sz w:val="22"/>
-                <w:szCs w:val="22"/>
-              </w:rPr>
-              <w:t xml:space="preserve">High</w:t>
-            </w:r>
-            <w:r>
-              <w:rPr>
-                <w:rFonts w:ascii="Arial" w:hAnsi="Arial" w:cs="Arial"/>
-                <w:sz w:val="22"/>
-                <w:szCs w:val="22"/>
-                <w:rtl/>
-              </w:rPr>
-              <w:t xml:space="preserve"> من </w:t>
-            </w:r>
-            <w:r>
-              <w:rPr>
-                <w:rFonts w:ascii="Arial" w:hAnsi="Arial" w:cs="Arial"/>
-                <w:sz w:val="22"/>
-                <w:szCs w:val="22"/>
-              </w:rPr>
-              <w:t xml:space="preserve">7.0) [23]</w:t>
+              <w:t xml:space="preserve">HiGHS [20]</w:t>
             </w:r>
             <w:r>
               <w:rPr>
@@ -5764,27 +5498,6 @@
         </w:tc>
       </w:tr>
     </w:tbl>
-    <w:p>
-      <w:pPr>
-        <w:spacing w:after="200"/>
-        <w:rPr>
-          <w:rFonts w:ascii="Vazirmatn" w:hAnsi="Vazirmatn" w:cs="Vazirmatn"/>
-        </w:rPr>
-      </w:pPr>
-    </w:p>
-    <w:p>
-      <w:pPr>
-        <w:rPr>
-          <w:rFonts w:ascii="Vazirmatn" w:hAnsi="Vazirmatn" w:cs="Vazirmatn"/>
-        </w:rPr>
-      </w:pPr>
-      <w:r>
-        <w:rPr>
-          <w:rFonts w:ascii="Vazirmatn" w:hAnsi="Vazirmatn" w:cs="Vazirmatn" w:hint="cs"/>
-        </w:rPr>
-        <w:br w:type="page"/>
-      </w:r>
-    </w:p>
     <w:tbl>
       <w:tblPr>
         <w:tblW w:w="9746" w:type="dxa"/>
@@ -5832,6 +5545,7 @@
           </w:tcPr>
           <w:p>
             <w:pPr>
+              <w:pageBreakBefore/>
               <w:spacing w:line="260" w:lineRule="auto"/>
               <w:rPr>
                 <w:rFonts w:ascii="Vazirmatn" w:hAnsi="Vazirmatn" w:cs="Vazirmatn"/>
@@ -6675,27 +6389,6 @@
         </w:tc>
       </w:tr>
     </w:tbl>
-    <w:p>
-      <w:pPr>
-        <w:spacing w:after="200"/>
-        <w:rPr>
-          <w:rFonts w:ascii="Vazirmatn" w:hAnsi="Vazirmatn" w:cs="Vazirmatn"/>
-        </w:rPr>
-      </w:pPr>
-    </w:p>
-    <w:p>
-      <w:pPr>
-        <w:rPr>
-          <w:rFonts w:ascii="Vazirmatn" w:hAnsi="Vazirmatn" w:cs="Vazirmatn"/>
-        </w:rPr>
-      </w:pPr>
-      <w:r>
-        <w:rPr>
-          <w:rFonts w:ascii="Vazirmatn" w:hAnsi="Vazirmatn" w:cs="Vazirmatn" w:hint="cs"/>
-        </w:rPr>
-        <w:br w:type="page"/>
-      </w:r>
-    </w:p>
     <w:tbl>
       <w:tblPr>
         <w:tblW w:w="9746" w:type="dxa"/>
@@ -6743,6 +6436,7 @@
           </w:tcPr>
           <w:p>
             <w:pPr>
+              <w:pageBreakBefore/>
               <w:spacing w:line="260" w:lineRule="auto"/>
               <w:rPr>
                 <w:rFonts w:ascii="Vazirmatn" w:hAnsi="Vazirmatn" w:cs="Vazirmatn"/>
@@ -7237,54 +6931,67 @@
                 <w:szCs w:val="22"/>
                 <w:rtl/>
               </w:rPr>
-              <w:t xml:space="preserve">مقارنة بالحلول التجارية </w:t>
-            </w:r>
-            <w:r>
-              <w:rPr>
-                <w:rFonts w:ascii="Arial" w:hAnsi="Arial" w:cs="Arial"/>
-                <w:b/>
-                <w:bCs/>
-                <w:sz w:val="22"/>
-                <w:szCs w:val="22"/>
-              </w:rPr>
-              <w:t xml:space="preserve">[11][12]</w:t>
-            </w:r>
-            <w:r>
-              <w:rPr>
-                <w:rFonts w:ascii="Arial" w:hAnsi="Arial" w:cs="Arial"/>
-                <w:b/>
-                <w:bCs/>
-                <w:sz w:val="22"/>
-                <w:szCs w:val="22"/>
-                <w:rtl/>
-              </w:rPr>
-              <w:t xml:space="preserve">:</w:t>
-            </w:r>
-            <w:r>
-              <w:rPr>
-                <w:rFonts w:ascii="Arial" w:hAnsi="Arial" w:cs="Arial"/>
-                <w:sz w:val="22"/>
-                <w:szCs w:val="22"/>
-                <w:rtl/>
-              </w:rPr>
-              <w:t xml:space="preserve"> الأهمية عندها قائمة يدوية أو قرار لكل جهاز، وفي </w:t>
-            </w:r>
-            <w:r>
-              <w:rPr>
-                <w:rFonts w:ascii="Arial" w:hAnsi="Arial" w:cs="Arial"/>
-                <w:sz w:val="22"/>
-                <w:szCs w:val="22"/>
-              </w:rPr>
-              <w:t xml:space="preserve">ACRS</w:t>
-            </w:r>
-            <w:r>
-              <w:rPr>
-                <w:rFonts w:ascii="Arial" w:hAnsi="Arial" w:cs="Arial"/>
-                <w:sz w:val="22"/>
-                <w:szCs w:val="22"/>
-                <w:rtl/>
-              </w:rPr>
-              <w:t xml:space="preserve"> تُوزن تلقائيًا مع الاعتماديات.</w:t>
+              <w:t xml:space="preserve">إجراء «التجزئة»:</w:t>
+            </w:r>
+            <w:r>
+              <w:rPr>
+                <w:rFonts w:ascii="Arial" w:hAnsi="Arial" w:cs="Arial"/>
+                <w:sz w:val="22"/>
+                <w:szCs w:val="22"/>
+                <w:rtl/>
+              </w:rPr>
+              <w:t xml:space="preserve"> رفع الاحتواء من </w:t>
+            </w:r>
+            <w:r>
+              <w:rPr>
+                <w:rFonts w:ascii="Arial" w:hAnsi="Arial" w:cs="Arial"/>
+                <w:sz w:val="22"/>
+                <w:szCs w:val="22"/>
+              </w:rPr>
+              <w:t xml:space="preserve">0.55</w:t>
+            </w:r>
+            <w:r>
+              <w:rPr>
+                <w:rFonts w:ascii="Arial" w:hAnsi="Arial" w:cs="Arial"/>
+                <w:sz w:val="22"/>
+                <w:szCs w:val="22"/>
+                <w:rtl/>
+              </w:rPr>
+              <w:t xml:space="preserve"> إلى </w:t>
+            </w:r>
+            <w:r>
+              <w:rPr>
+                <w:rFonts w:ascii="Arial" w:hAnsi="Arial" w:cs="Arial"/>
+                <w:sz w:val="22"/>
+                <w:szCs w:val="22"/>
+              </w:rPr>
+              <w:t xml:space="preserve">0.977</w:t>
+            </w:r>
+            <w:r>
+              <w:rPr>
+                <w:rFonts w:ascii="Arial" w:hAnsi="Arial" w:cs="Arial"/>
+                <w:sz w:val="22"/>
+                <w:szCs w:val="22"/>
+                <w:rtl/>
+              </w:rPr>
+              <w:t xml:space="preserve"> على نفس </w:t>
+            </w:r>
+            <w:r>
+              <w:rPr>
+                <w:rFonts w:ascii="Arial" w:hAnsi="Arial" w:cs="Arial"/>
+                <w:sz w:val="22"/>
+                <w:szCs w:val="22"/>
+              </w:rPr>
+              <w:t xml:space="preserve">259</w:t>
+            </w:r>
+            <w:r>
+              <w:rPr>
+                <w:rFonts w:ascii="Arial" w:hAnsi="Arial" w:cs="Arial"/>
+                <w:sz w:val="22"/>
+                <w:szCs w:val="22"/>
+                <w:rtl/>
+              </w:rPr>
+              <w:t xml:space="preserve"> سلسلة.</w:t>
             </w:r>
           </w:p>
           <w:p>
@@ -7318,100 +7025,6 @@
                 <w:szCs w:val="22"/>
                 <w:rtl/>
               </w:rPr>
-              <w:t xml:space="preserve">إجراء «التجزئة»:</w:t>
-            </w:r>
-            <w:r>
-              <w:rPr>
-                <w:rFonts w:ascii="Arial" w:hAnsi="Arial" w:cs="Arial"/>
-                <w:sz w:val="22"/>
-                <w:szCs w:val="22"/>
-                <w:rtl/>
-              </w:rPr>
-              <w:t xml:space="preserve"> رفع الاحتواء من </w:t>
-            </w:r>
-            <w:r>
-              <w:rPr>
-                <w:rFonts w:ascii="Arial" w:hAnsi="Arial" w:cs="Arial"/>
-                <w:sz w:val="22"/>
-                <w:szCs w:val="22"/>
-              </w:rPr>
-              <w:t xml:space="preserve">0.55</w:t>
-            </w:r>
-            <w:r>
-              <w:rPr>
-                <w:rFonts w:ascii="Arial" w:hAnsi="Arial" w:cs="Arial"/>
-                <w:sz w:val="22"/>
-                <w:szCs w:val="22"/>
-                <w:rtl/>
-              </w:rPr>
-              <w:t xml:space="preserve"> إلى </w:t>
-            </w:r>
-            <w:r>
-              <w:rPr>
-                <w:rFonts w:ascii="Arial" w:hAnsi="Arial" w:cs="Arial"/>
-                <w:sz w:val="22"/>
-                <w:szCs w:val="22"/>
-              </w:rPr>
-              <w:t xml:space="preserve">0.977</w:t>
-            </w:r>
-            <w:r>
-              <w:rPr>
-                <w:rFonts w:ascii="Arial" w:hAnsi="Arial" w:cs="Arial"/>
-                <w:sz w:val="22"/>
-                <w:szCs w:val="22"/>
-                <w:rtl/>
-              </w:rPr>
-              <w:t xml:space="preserve"> على نفس </w:t>
-            </w:r>
-            <w:r>
-              <w:rPr>
-                <w:rFonts w:ascii="Arial" w:hAnsi="Arial" w:cs="Arial"/>
-                <w:sz w:val="22"/>
-                <w:szCs w:val="22"/>
-              </w:rPr>
-              <w:t xml:space="preserve">259</w:t>
-            </w:r>
-            <w:r>
-              <w:rPr>
-                <w:rFonts w:ascii="Arial" w:hAnsi="Arial" w:cs="Arial"/>
-                <w:sz w:val="22"/>
-                <w:szCs w:val="22"/>
-                <w:rtl/>
-              </w:rPr>
-              <w:t xml:space="preserve"> سلسلة.</w:t>
-            </w:r>
-          </w:p>
-          <w:p>
-            <w:pPr>
-              <w:bidi/>
-              <w:spacing w:after="60" w:line="300" w:lineRule="auto"/>
-              <w:ind w:start="340" w:hanging="340"/>
-              <w:jc w:val="both"/>
-              <w:rPr>
-                <w:rFonts w:ascii="Arial" w:hAnsi="Arial" w:cs="Arial"/>
-                <w:sz w:val="22"/>
-                <w:szCs w:val="22"/>
-                <w:rtl/>
-              </w:rPr>
-            </w:pPr>
-            <w:r>
-              <w:rPr>
-                <w:rFonts w:ascii="Arial" w:hAnsi="Arial" w:cs="Arial"/>
-                <w:sz w:val="22"/>
-                <w:szCs w:val="22"/>
-                <w:rtl/>
-              </w:rPr>
-              <w:t xml:space="preserve">–  </w:t>
-            </w:r>
-            <w:r>
-              <w:rPr>
-                <w:rFonts w:ascii="Arial" w:hAnsi="Arial" w:cs="Arial"/>
-                <w:b/>
-                <w:bCs/>
-                <w:sz w:val="22"/>
-                <w:szCs w:val="22"/>
-                <w:rtl/>
-              </w:rPr>
               <w:t xml:space="preserve">«أصغر عقوبة آمنة»:</w:t>
             </w:r>
             <w:r>
@@ -7429,7 +7042,7 @@
                 <w:sz w:val="22"/>
                 <w:szCs w:val="22"/>
               </w:rPr>
-              <w:t xml:space="preserve">[18]</w:t>
+              <w:t xml:space="preserve">[21]</w:t>
             </w:r>
             <w:r>
               <w:rPr>
@@ -7602,27 +7215,6 @@
         </w:tc>
       </w:tr>
     </w:tbl>
-    <w:p>
-      <w:pPr>
-        <w:spacing w:after="200"/>
-        <w:rPr>
-          <w:rFonts w:ascii="Vazirmatn" w:hAnsi="Vazirmatn" w:cs="Vazirmatn"/>
-        </w:rPr>
-      </w:pPr>
-    </w:p>
-    <w:p>
-      <w:pPr>
-        <w:rPr>
-          <w:rFonts w:ascii="Vazirmatn" w:hAnsi="Vazirmatn" w:cs="Vazirmatn"/>
-        </w:rPr>
-      </w:pPr>
-      <w:r>
-        <w:rPr>
-          <w:rFonts w:ascii="Vazirmatn" w:hAnsi="Vazirmatn" w:cs="Vazirmatn" w:hint="cs"/>
-        </w:rPr>
-        <w:br w:type="page"/>
-      </w:r>
-    </w:p>
     <w:tbl>
       <w:tblPr>
         <w:tblW w:w="9746" w:type="dxa"/>
@@ -7670,6 +7262,7 @@
           </w:tcPr>
           <w:p>
             <w:pPr>
+              <w:pageBreakBefore/>
               <w:spacing w:line="260" w:lineRule="auto"/>
               <w:rPr>
                 <w:rFonts w:ascii="Vazirmatn" w:hAnsi="Vazirmatn" w:cs="Vazirmatn"/>
@@ -10032,7 +9625,7 @@
                       <w:sz w:val="19"/>
                       <w:szCs w:val="19"/>
                     </w:rPr>
-                    <w:t xml:space="preserve">CVaR [24])</w:t>
+                    <w:t xml:space="preserve">CVaR [22])</w:t>
                   </w:r>
                   <w:r>
                     <w:rPr>
@@ -10945,7 +10538,7 @@
                 <w:sz w:val="22"/>
                 <w:szCs w:val="22"/>
               </w:rPr>
-              <w:t xml:space="preserve">PwC [25]</w:t>
+              <w:t xml:space="preserve">PwC [24]</w:t>
             </w:r>
             <w:r>
               <w:rPr>
@@ -11013,7 +10606,7 @@
                 <w:sz w:val="22"/>
                 <w:szCs w:val="22"/>
               </w:rPr>
-              <w:t xml:space="preserve">The DFIR Report [26]</w:t>
+              <w:t xml:space="preserve">The DFIR Report [25]</w:t>
             </w:r>
             <w:r>
               <w:rPr>
@@ -11030,7 +10623,7 @@
                 <w:sz w:val="22"/>
                 <w:szCs w:val="22"/>
               </w:rPr>
-              <w:t xml:space="preserve">MITRE Attack Flow [27]</w:t>
+              <w:t xml:space="preserve">MITRE Attack Flow [26]</w:t>
             </w:r>
             <w:r>
               <w:rPr>
@@ -11047,7 +10640,7 @@
                 <w:sz w:val="22"/>
                 <w:szCs w:val="22"/>
               </w:rPr>
-              <w:t xml:space="preserve">CISA [28] (207</w:t>
+              <w:t xml:space="preserve">CISA [27] (207</w:t>
             </w:r>
             <w:r>
               <w:rPr>
@@ -16154,7 +15747,7 @@
                 <w:sz w:val="22"/>
                 <w:szCs w:val="22"/>
               </w:rPr>
-              <w:t xml:space="preserve">MITRE ATT&amp;CK [29]</w:t>
+              <w:t xml:space="preserve">MITRE ATT&amp;CK [28]</w:t>
             </w:r>
             <w:r>
               <w:rPr>
@@ -19963,7 +19556,7 @@
                 <w:sz w:val="22"/>
                 <w:szCs w:val="22"/>
               </w:rPr>
-              <w:t xml:space="preserve">[25]</w:t>
+              <w:t xml:space="preserve">[24]</w:t>
             </w:r>
             <w:r>
               <w:rPr>
@@ -20706,7 +20299,7 @@
                 <w:sz w:val="22"/>
                 <w:szCs w:val="22"/>
               </w:rPr>
-              <w:t xml:space="preserve">[30]</w:t>
+              <w:t xml:space="preserve">[29]</w:t>
             </w:r>
             <w:r>
               <w:rPr>
@@ -21208,7 +20801,7 @@
                 <w:sz w:val="22"/>
                 <w:szCs w:val="22"/>
               </w:rPr>
-              <w:t xml:space="preserve">[18]</w:t>
+              <w:t xml:space="preserve">[21]</w:t>
             </w:r>
             <w:r>
               <w:rPr>
@@ -21862,7 +21455,7 @@
                 <w:sz w:val="22"/>
                 <w:szCs w:val="22"/>
               </w:rPr>
-              <w:t xml:space="preserve">[31]</w:t>
+              <w:t xml:space="preserve">[30]</w:t>
             </w:r>
             <w:r>
               <w:rPr>
@@ -22566,7 +22159,7 @@
                 <w:sz w:val="22"/>
                 <w:szCs w:val="22"/>
               </w:rPr>
-              <w:t xml:space="preserve">Z3 [20])</w:t>
+              <w:t xml:space="preserve">Z3 [19])</w:t>
             </w:r>
             <w:r>
               <w:rPr>
@@ -23367,7 +22960,7 @@
                       <w:sz w:val="19"/>
                       <w:szCs w:val="19"/>
                     </w:rPr>
-                    <w:t xml:space="preserve">CIC-IDS2017 [32])</w:t>
+                    <w:t xml:space="preserve">CIC-IDS2017 [31])</w:t>
                   </w:r>
                   <w:r>
                     <w:rPr>
@@ -24626,7 +24219,7 @@
                 <w:sz w:val="19"/>
                 <w:szCs w:val="19"/>
               </w:rPr>
-              <w:t xml:space="preserve">[18]  Cogburn, C. V., DeCusatis, C., &amp; Spillane, E. (2026). Hardware-Aware QAOA for Honeypot Traffic Partitioning on 100+ Qubit IBM Quantum Processors. arXiv:2606.09469. https://arxiv.org/abs/2606.09469</w:t>
+              <w:t xml:space="preserve">[18]  Sha, L. (2001). Using simplicity to control complexity. IEEE Software, 18(4), 20–28. https://doi.org/10.1109/MS.2001.936213</w:t>
             </w:r>
           </w:p>
           <w:p>
@@ -24642,7 +24235,7 @@
                 <w:sz w:val="19"/>
                 <w:szCs w:val="19"/>
               </w:rPr>
-              <w:t xml:space="preserve">[19]  Sha, L. (2001). Using simplicity to control complexity. IEEE Software, 18(4), 20–28. https://doi.org/10.1109/MS.2001.936213</w:t>
+              <w:t xml:space="preserve">[19]  de Moura, L., &amp; Bjørner, N. (2008). Z3: An Efficient SMT Solver. In Tools and Algorithms for the Construction and Analysis of Systems (TACAS 2008), LNCS 4963, 337–340. Springer. https://doi.org/10.1007/978-3-540-78800-3_24</w:t>
             </w:r>
           </w:p>
           <w:p>
@@ -24658,7 +24251,7 @@
                 <w:sz w:val="19"/>
                 <w:szCs w:val="19"/>
               </w:rPr>
-              <w:t xml:space="preserve">[20]  de Moura, L., &amp; Bjørner, N. (2008). Z3: An Efficient SMT Solver. In Tools and Algorithms for the Construction and Analysis of Systems (TACAS 2008), LNCS 4963, 337–340. Springer. https://doi.org/10.1007/978-3-540-78800-3_24</w:t>
+              <w:t xml:space="preserve">[20]  Huangfu, Q., &amp; Hall, J. A. J. (2018). Parallelizing the dual revised simplex method. Mathematical Programming Computation, 10(1), 119–142. https://doi.org/10.1007/s12532-017-0130-5</w:t>
             </w:r>
           </w:p>
           <w:p>
@@ -24674,7 +24267,7 @@
                 <w:sz w:val="19"/>
                 <w:szCs w:val="19"/>
               </w:rPr>
-              <w:t xml:space="preserve">[21]  Huangfu, Q., &amp; Hall, J. A. J. (2018). Parallelizing the dual revised simplex method. Mathematical Programming Computation, 10(1), 119–142. https://doi.org/10.1007/s12532-017-0130-5</w:t>
+              <w:t xml:space="preserve">[21]  Cogburn, C. V., DeCusatis, C., &amp; Spillane, E. (2026). Hardware-Aware QAOA for Honeypot Traffic Partitioning on 100+ Qubit IBM Quantum Processors. arXiv:2606.09469. https://arxiv.org/abs/2606.09469</w:t>
             </w:r>
           </w:p>
           <w:p>
@@ -24690,7 +24283,7 @@
                 <w:sz w:val="19"/>
                 <w:szCs w:val="19"/>
               </w:rPr>
-              <w:t xml:space="preserve">[22]  Stouffer, K., et al. (2023). Guide to Operational Technology (OT) Security (NIST Special Publication 800-82r3). National Institute of Standards and Technology. https://doi.org/10.6028/NIST.SP.800-82r3</w:t>
+              <w:t xml:space="preserve">[22]  Barkoutsos, P. K., Nannicini, G., Robert, A., Tavernelli, I., &amp; Woerner, S. (2020). Improving Variational Quantum Optimization using CVaR. Quantum, 4, 256. https://doi.org/10.22331/q-2020-04-20-256</w:t>
             </w:r>
           </w:p>
           <w:p>
@@ -24722,7 +24315,7 @@
                 <w:sz w:val="19"/>
                 <w:szCs w:val="19"/>
               </w:rPr>
-              <w:t xml:space="preserve">[24]  Barkoutsos, P. K., Nannicini, G., Robert, A., Tavernelli, I., &amp; Woerner, S. (2020). Improving Variational Quantum Optimization using CVaR. Quantum, 4, 256. https://doi.org/10.22331/q-2020-04-20-256</w:t>
+              <w:t xml:space="preserve">[24]  PwC. (2021). Conti cyber attack on the HSE: Independent post incident review. Health Service Executive (Ireland). https://www.hse.ie/eng/services/publications/conti-cyber-attack-on-the-hse-full-report.pdf</w:t>
             </w:r>
           </w:p>
           <w:p>
@@ -24738,7 +24331,7 @@
                 <w:sz w:val="19"/>
                 <w:szCs w:val="19"/>
               </w:rPr>
-              <w:t xml:space="preserve">[25]  PwC. (2021). Conti cyber attack on the HSE: Independent post incident review. Health Service Executive (Ireland). https://www.hse.ie/eng/services/publications/conti-cyber-attack-on-the-hse-full-report.pdf</w:t>
+              <w:t xml:space="preserve">[25]  The DFIR Report. (2021–2026). Intrusion reports. https://thedfirreport.com/</w:t>
             </w:r>
           </w:p>
           <w:p>
@@ -24754,7 +24347,7 @@
                 <w:sz w:val="19"/>
                 <w:szCs w:val="19"/>
               </w:rPr>
-              <w:t xml:space="preserve">[26]  The DFIR Report. (2021–2026). Intrusion reports. https://thedfirreport.com/</w:t>
+              <w:t xml:space="preserve">[26]  MITRE Center for Threat-Informed Defense. (2024). Attack Flow (v2) and the Attack Flow corpus [Software and data]. https://github.com/center-for-threat-informed-defense/attack-flow</w:t>
             </w:r>
           </w:p>
           <w:p>
@@ -24770,7 +24363,7 @@
                 <w:sz w:val="19"/>
                 <w:szCs w:val="19"/>
               </w:rPr>
-              <w:t xml:space="preserve">[27]  MITRE Center for Threat-Informed Defense. (2024). Attack Flow (v2) and the Attack Flow corpus [Software and data]. https://github.com/center-for-threat-informed-defense/attack-flow</w:t>
+              <w:t xml:space="preserve">[27]  Cybersecurity and Infrastructure Security Agency (CISA). (2013–2026). Cybersecurity Advisories. https://www.cisa.gov/news-events/cybersecurity-advisories</w:t>
             </w:r>
           </w:p>
           <w:p>
@@ -24786,7 +24379,7 @@
                 <w:sz w:val="19"/>
                 <w:szCs w:val="19"/>
               </w:rPr>
-              <w:t xml:space="preserve">[28]  Cybersecurity and Infrastructure Security Agency (CISA). (2013–2026). Cybersecurity Advisories. https://www.cisa.gov/news-events/cybersecurity-advisories</w:t>
+              <w:t xml:space="preserve">[28]  MITRE. (2026). MITRE ATT&amp;CK® (Enterprise and ICS matrices). https://attack.mitre.org/</w:t>
             </w:r>
           </w:p>
           <w:p>
@@ -24802,7 +24395,63 @@
                 <w:sz w:val="19"/>
                 <w:szCs w:val="19"/>
               </w:rPr>
-              <w:t xml:space="preserve">[29]  MITRE. (2026). MITRE ATT&amp;CK® (Enterprise and ICS matrices). https://attack.mitre.org/</w:t>
+              <w:t xml:space="preserve">[29]  National Institute of Standards and Technology. (2024). Module-Lattice-Based Digital Signature Standard (FIPS 204). https://doi.org/10.6028/NIST.FIPS.204</w:t>
+            </w:r>
+          </w:p>
+          <w:p>
+            <w:pPr>
+              <w:bidi/>
+              <w:spacing w:after="50" w:line="300" w:lineRule="auto"/>
+              <w:ind w:start="520" w:hanging="520"/>
+              <w:jc w:val="start"/>
+              <w:rPr>
+                <w:rFonts w:ascii="Arial" w:hAnsi="Arial" w:cs="Arial"/>
+                <w:sz w:val="19"/>
+                <w:szCs w:val="19"/>
+                <w:rtl/>
+              </w:rPr>
+            </w:pPr>
+            <w:r>
+              <w:rPr>
+                <w:rFonts w:ascii="Arial" w:hAnsi="Arial" w:cs="Arial"/>
+                <w:sz w:val="19"/>
+                <w:szCs w:val="19"/>
+              </w:rPr>
+              <w:t xml:space="preserve">[30]</w:t>
+            </w:r>
+            <w:r>
+              <w:rPr>
+                <w:rFonts w:ascii="Arial" w:hAnsi="Arial" w:cs="Arial"/>
+                <w:sz w:val="19"/>
+                <w:szCs w:val="19"/>
+                <w:rtl/>
+              </w:rPr>
+              <w:t xml:space="preserve">  الهيئة السعودية للبيانات والذكاء الاصطناعي (سدايا). (</w:t>
+            </w:r>
+            <w:r>
+              <w:rPr>
+                <w:rFonts w:ascii="Arial" w:hAnsi="Arial" w:cs="Arial"/>
+                <w:sz w:val="19"/>
+                <w:szCs w:val="19"/>
+              </w:rPr>
+              <w:t xml:space="preserve">2023)</w:t>
+            </w:r>
+            <w:r>
+              <w:rPr>
+                <w:rFonts w:ascii="Arial" w:hAnsi="Arial" w:cs="Arial"/>
+                <w:sz w:val="19"/>
+                <w:szCs w:val="19"/>
+                <w:rtl/>
+              </w:rPr>
+              <w:t xml:space="preserve">. مبادئ أخلاقيات الذكاء الاصطناعي (الإصدار </w:t>
+            </w:r>
+            <w:r>
+              <w:rPr>
+                <w:rFonts w:ascii="Arial" w:hAnsi="Arial" w:cs="Arial"/>
+                <w:sz w:val="19"/>
+                <w:szCs w:val="19"/>
+              </w:rPr>
+              <w:t xml:space="preserve">1.0). https://sdaia.gov.sa/en/SDAIA/about/Documents/ai-principles.pdf</w:t>
             </w:r>
           </w:p>
           <w:p>
@@ -24818,63 +24467,7 @@
                 <w:sz w:val="19"/>
                 <w:szCs w:val="19"/>
               </w:rPr>
-              <w:t xml:space="preserve">[30]  National Institute of Standards and Technology. (2024). Module-Lattice-Based Digital Signature Standard (FIPS 204). https://doi.org/10.6028/NIST.FIPS.204</w:t>
-            </w:r>
-          </w:p>
-          <w:p>
-            <w:pPr>
-              <w:bidi/>
-              <w:spacing w:after="50" w:line="300" w:lineRule="auto"/>
-              <w:ind w:start="520" w:hanging="520"/>
-              <w:jc w:val="start"/>
-              <w:rPr>
-                <w:rFonts w:ascii="Arial" w:hAnsi="Arial" w:cs="Arial"/>
-                <w:sz w:val="19"/>
-                <w:szCs w:val="19"/>
-                <w:rtl/>
-              </w:rPr>
-            </w:pPr>
-            <w:r>
-              <w:rPr>
-                <w:rFonts w:ascii="Arial" w:hAnsi="Arial" w:cs="Arial"/>
-                <w:sz w:val="19"/>
-                <w:szCs w:val="19"/>
-              </w:rPr>
-              <w:t xml:space="preserve">[31]</w:t>
-            </w:r>
-            <w:r>
-              <w:rPr>
-                <w:rFonts w:ascii="Arial" w:hAnsi="Arial" w:cs="Arial"/>
-                <w:sz w:val="19"/>
-                <w:szCs w:val="19"/>
-                <w:rtl/>
-              </w:rPr>
-              <w:t xml:space="preserve">  الهيئة السعودية للبيانات والذكاء الاصطناعي (سدايا). (</w:t>
-            </w:r>
-            <w:r>
-              <w:rPr>
-                <w:rFonts w:ascii="Arial" w:hAnsi="Arial" w:cs="Arial"/>
-                <w:sz w:val="19"/>
-                <w:szCs w:val="19"/>
-              </w:rPr>
-              <w:t xml:space="preserve">2023)</w:t>
-            </w:r>
-            <w:r>
-              <w:rPr>
-                <w:rFonts w:ascii="Arial" w:hAnsi="Arial" w:cs="Arial"/>
-                <w:sz w:val="19"/>
-                <w:szCs w:val="19"/>
-                <w:rtl/>
-              </w:rPr>
-              <w:t xml:space="preserve">. مبادئ أخلاقيات الذكاء الاصطناعي (الإصدار </w:t>
-            </w:r>
-            <w:r>
-              <w:rPr>
-                <w:rFonts w:ascii="Arial" w:hAnsi="Arial" w:cs="Arial"/>
-                <w:sz w:val="19"/>
-                <w:szCs w:val="19"/>
-              </w:rPr>
-              <w:t xml:space="preserve">1.0). https://sdaia.gov.sa/en/SDAIA/about/Documents/ai-principles.pdf</w:t>
+              <w:t xml:space="preserve">[31]  Sharafaldin, I., Lashkari, A. H., &amp; Ghorbani, A. A. (2018). Toward Generating a New Intrusion Detection Dataset and Intrusion Traffic Characterization. In Proceedings of ICISSP 2018, 108–116. https://doi.org/10.5220/0006639801080116</w:t>
             </w:r>
           </w:p>
           <w:p>
@@ -24890,7 +24483,7 @@
                 <w:sz w:val="19"/>
                 <w:szCs w:val="19"/>
               </w:rPr>
-              <w:t xml:space="preserve">[32]  Sharafaldin, I., Lashkari, A. H., &amp; Ghorbani, A. A. (2018). Toward Generating a New Intrusion Detection Dataset and Intrusion Traffic Characterization. In Proceedings of ICISSP 2018, 108–116. https://doi.org/10.5220/0006639801080116</w:t>
+              <w:t xml:space="preserve">[32]  Anthropic. (2026). Claude (Opus) [Large language model]. Used September–October 2026 for code assistance, analysis, source search and drafting support, as disclosed in this section. https://claude.ai</w:t>
             </w:r>
           </w:p>
           <w:p>
@@ -24906,23 +24499,7 @@
                 <w:sz w:val="19"/>
                 <w:szCs w:val="19"/>
               </w:rPr>
-              <w:t xml:space="preserve">[33]  Anthropic. (2026). Claude (Opus) [Large language model]. Used September–October 2026 for code assistance, analysis, source search and drafting support, as disclosed in this section. https://claude.ai</w:t>
-            </w:r>
-          </w:p>
-          <w:p>
-            <w:pPr>
-              <w:bidi w:val="0"/>
-              <w:spacing w:after="50" w:line="276" w:lineRule="auto"/>
-              <w:ind w:left="520" w:hanging="520"/>
-              <w:jc w:val="left"/>
-            </w:pPr>
-            <w:r>
-              <w:rPr>
-                <w:rFonts w:ascii="Arial" w:hAnsi="Arial" w:cs="Arial"/>
-                <w:sz w:val="19"/>
-                <w:szCs w:val="19"/>
-              </w:rPr>
-              <w:t xml:space="preserve">[34]  OpenAI. (2026). ChatGPT and Codex [Large language models]. Used September–October 2026 as an independent reviewer of text and code. https://chatgpt.com</w:t>
+              <w:t xml:space="preserve">[33]  OpenAI. (2026). ChatGPT and Codex [Large language models]. Used September–October 2026 as an independent reviewer of text and code. https://chatgpt.com</w:t>
             </w:r>
           </w:p>
           <w:p>
@@ -25006,7 +24583,7 @@
                 <w:sz w:val="22"/>
                 <w:szCs w:val="22"/>
               </w:rPr>
-              <w:t xml:space="preserve">Anthropic) [33]</w:t>
+              <w:t xml:space="preserve">Anthropic) [32]</w:t>
             </w:r>
             <w:r>
               <w:rPr>
@@ -25040,7 +24617,7 @@
                 <w:sz w:val="22"/>
                 <w:szCs w:val="22"/>
               </w:rPr>
-              <w:t xml:space="preserve">OpenAI) [34]</w:t>
+              <w:t xml:space="preserve">OpenAI) [33]</w:t>
             </w:r>
             <w:r>
               <w:rPr>

</xml_diff>

<commit_message>
form v18: feasibility (S2), verified judge-review fixes (91% context, v12 label, 80% target, fair [17] comparison, disclosure wording, location)
Co-Authored-By: Claude Opus 5.5 <noreply@anthropic.com>
Claude-Session: https://claude.ai/code/session_011J2KrGUp2npQo9Tosx1KRc
</commit_message>
<xml_diff>
--- a/docs/qacrs/form_drafts/IBDAA_2027_FORM_ACRS_v18.docx
+++ b/docs/qacrs/form_drafts/IBDAA_2027_FORM_ACRS_v18.docx
@@ -2888,7 +2888,7 @@
                 <w:szCs w:val="22"/>
                 <w:rtl/>
               </w:rPr>
-              <w:t xml:space="preserve">، نظام استجابة آلية للاختراق: عندما يصله تنبيه بهجوم يحتويه ويُخرجه والأنظمة تعمل؛ فبدل أن يُعزل النظام كاملًا يُعزل الجزء الخطر فقط. وصغنا القرار للشبكة كاملة كلغز تحسين ثنائي (</w:t>
+              <w:t xml:space="preserve">، نظام استجابة آلية للاختراق: عندما وصله تنبيه بهجوم احتواه وأخرجه والأنظمة تعمل؛ فبدل أن يُعزل النظام كاملًا عُزل الجزء الخطر فقط. وصغنا القرار للشبكة كاملة كلغز تحسين ثنائي (</w:t>
             </w:r>
             <w:r>
               <w:rPr>
@@ -2905,7 +2905,7 @@
                 <w:szCs w:val="22"/>
                 <w:rtl/>
               </w:rPr>
-              <w:t xml:space="preserve"> يوازن بين خطورة الهجوم وأهمية الجهاز وما يعتمد عليه، ويختار لكل جهاز درجة: عزل، أو تقييد، أو «تجزئة» للخادم الحرج تُبقي اتصالاته الضرورية تعمل وتقطع طرق المهاجم فقط. وفصلنا بوابة سلامة بسيطة عن المُحسِّن الذكي، فلا يُنفَّذ قرار حرج إلا بموافقة الشخص المسؤول.</w:t>
+              <w:t xml:space="preserve"> وازن بين خطورة الهجوم وأهمية الجهاز وما يعتمد عليه، واختار لكل جهاز درجة: عزل، أو تقييد، أو «تجزئة» للخادم الحرج أبقت اتصالاته الضرورية تعمل وقطعت طرق المهاجم فقط. وفصلنا بوابة سلامة بسيطة عن المُحسِّن الذكي، فلم يُنفَّذ قرار حرج إلا بموافقة الشخص المسؤول.</w:t>
             </w:r>
           </w:p>
           <w:p>
@@ -2944,7 +2944,24 @@
                 <w:szCs w:val="22"/>
                 <w:rtl/>
               </w:rPr>
-              <w:t xml:space="preserve"> قبل كل تجربة. على </w:t>
+              <w:t xml:space="preserve"> قبل كل تجربة منذ </w:t>
+            </w:r>
+            <w:r>
+              <w:rPr>
+                <w:rFonts w:ascii="Arial" w:hAnsi="Arial" w:cs="Arial"/>
+                <w:sz w:val="22"/>
+                <w:szCs w:val="22"/>
+              </w:rPr>
+              <w:t xml:space="preserve">v2</w:t>
+            </w:r>
+            <w:r>
+              <w:rPr>
+                <w:rFonts w:ascii="Arial" w:hAnsi="Arial" w:cs="Arial"/>
+                <w:sz w:val="22"/>
+                <w:szCs w:val="22"/>
+                <w:rtl/>
+              </w:rPr>
+              <w:t xml:space="preserve">. على </w:t>
             </w:r>
             <w:r>
               <w:rPr>
@@ -3063,7 +3080,7 @@
                 <w:szCs w:val="22"/>
                 <w:rtl/>
               </w:rPr>
-              <w:t xml:space="preserve"> حادثة حقيقية موثقة بلغ الاحتواء التلقائي </w:t>
+              <w:t xml:space="preserve"> حادثة وخطة محاكاة خصوم موثقة احتوى تلقائيًا </w:t>
             </w:r>
             <w:r>
               <w:rPr>
@@ -3097,7 +3114,41 @@
                 <w:szCs w:val="22"/>
                 <w:rtl/>
               </w:rPr>
-              <w:t xml:space="preserve"> لحظات اكتشاف. وقطع النظام المهاجم خلال </w:t>
+              <w:t xml:space="preserve"> لحظات اكتشاف، بـ</w:t>
+            </w:r>
+            <w:r>
+              <w:rPr>
+                <w:rFonts w:ascii="Arial" w:hAnsi="Arial" w:cs="Arial"/>
+                <w:sz w:val="22"/>
+                <w:szCs w:val="22"/>
+              </w:rPr>
+              <w:t xml:space="preserve">70</w:t>
+            </w:r>
+            <w:r>
+              <w:rPr>
+                <w:rFonts w:ascii="Arial" w:hAnsi="Arial" w:cs="Arial"/>
+                <w:sz w:val="22"/>
+                <w:szCs w:val="22"/>
+                <w:rtl/>
+              </w:rPr>
+              <w:t xml:space="preserve"> خدمة متوقفة بعد الموافقات مقابل </w:t>
+            </w:r>
+            <w:r>
+              <w:rPr>
+                <w:rFonts w:ascii="Arial" w:hAnsi="Arial" w:cs="Arial"/>
+                <w:sz w:val="22"/>
+                <w:szCs w:val="22"/>
+              </w:rPr>
+              <w:t xml:space="preserve">268</w:t>
+            </w:r>
+            <w:r>
+              <w:rPr>
+                <w:rFonts w:ascii="Arial" w:hAnsi="Arial" w:cs="Arial"/>
+                <w:sz w:val="22"/>
+                <w:szCs w:val="22"/>
+                <w:rtl/>
+              </w:rPr>
+              <w:t xml:space="preserve"> للعزل الكامل. وقطع النظام المهاجم خلال </w:t>
             </w:r>
             <w:r>
               <w:rPr>
@@ -3182,7 +3233,7 @@
                 <w:szCs w:val="22"/>
                 <w:rtl/>
               </w:rPr>
-              <w:t xml:space="preserve">؛ لكن على السيناريوهات الحقيقية بلغ الزمن </w:t>
+              <w:t xml:space="preserve">؛ لكن على السيناريوهات الحقيقية والواقعية بلغ الزمن </w:t>
             </w:r>
             <w:r>
               <w:rPr>
@@ -3340,24 +3391,7 @@
                 <w:szCs w:val="22"/>
                 <w:rtl/>
               </w:rPr>
-              <w:t xml:space="preserve"> جهازًا. والحاسوب الكمّي أبطأ اليوم ولم ندّعِ تفوقًا كمّيًا، لكن مسألتنا بالشكل نفسه الذي يحله، فيكون </w:t>
-            </w:r>
-            <w:r>
-              <w:rPr>
-                <w:rFonts w:ascii="Arial" w:hAnsi="Arial" w:cs="Arial"/>
-                <w:sz w:val="22"/>
-                <w:szCs w:val="22"/>
-              </w:rPr>
-              <w:t xml:space="preserve">ACRS</w:t>
-            </w:r>
-            <w:r>
-              <w:rPr>
-                <w:rFonts w:ascii="Arial" w:hAnsi="Arial" w:cs="Arial"/>
-                <w:sz w:val="22"/>
-                <w:szCs w:val="22"/>
-                <w:rtl/>
-              </w:rPr>
-              <w:t xml:space="preserve"> جاهزًا عندما يتطور. وكانت الحوادث الحقيقية مُعاد بناؤها من تقارير عامة، وأشارت النتائج إلى أن الأنظمة يمكن أن تحتوي الهجوم مع استمرار الخدمة متى وصل التنبيه.</w:t>
+              <w:t xml:space="preserve"> جهازًا. والحاسوب الكمّي أبطأ اليوم ولم ندّعِ تفوقًا كمّيًا، وأضفناه لأن مسألتنا بالشكل نفسه الذي يحله. وكانت الحوادث الحقيقية مُعاد بناؤها من تقارير عامة، وأشارت النتائج إلى أن الأنظمة يمكن أن تحتوي الهجوم مع استمرار الخدمة متى وصل التنبيه.</w:t>
             </w:r>
           </w:p>
         </w:tc>
@@ -4321,6 +4355,106 @@
                 <w:szCs w:val="22"/>
                 <w:rtl/>
               </w:rPr>
+              <w:t xml:space="preserve">المتأثرون:</w:t>
+            </w:r>
+            <w:r>
+              <w:rPr>
+                <w:rFonts w:ascii="Arial" w:hAnsi="Arial" w:cs="Arial"/>
+                <w:sz w:val="22"/>
+                <w:szCs w:val="22"/>
+                <w:rtl/>
+              </w:rPr>
+              <w:t xml:space="preserve"> المرضى، وعملاء البنوك، والحجاج، وكل من يعتمد على الخدمات الحيوية، والموظفون الذين يفقدون أنظمتهم، وفرق الأمن التي تقرر العزل تحت ضغط الوقت.</w:t>
+            </w:r>
+          </w:p>
+          <w:p>
+            <w:pPr>
+              <w:bidi/>
+              <w:spacing w:after="100" w:line="300" w:lineRule="auto"/>
+              <w:jc w:val="both"/>
+              <w:rPr>
+                <w:rFonts w:ascii="Arial" w:hAnsi="Arial" w:cs="Arial"/>
+                <w:sz w:val="22"/>
+                <w:szCs w:val="22"/>
+                <w:rtl/>
+              </w:rPr>
+            </w:pPr>
+            <w:r>
+              <w:rPr>
+                <w:rFonts w:ascii="Arial" w:hAnsi="Arial" w:cs="Arial"/>
+                <w:b/>
+                <w:bCs/>
+                <w:sz w:val="22"/>
+                <w:szCs w:val="22"/>
+                <w:rtl/>
+              </w:rPr>
+              <w:t xml:space="preserve">قابلية المعالجة:</w:t>
+            </w:r>
+            <w:r>
+              <w:rPr>
+                <w:rFonts w:ascii="Arial" w:hAnsi="Arial" w:cs="Arial"/>
+                <w:sz w:val="22"/>
+                <w:szCs w:val="22"/>
+                <w:rtl/>
+              </w:rPr>
+              <w:t xml:space="preserve"> المشكلة قابلة للحل فعليًا لأنها مسألة تحسين محددة، والمدخلات التي يحتاجها </w:t>
+            </w:r>
+            <w:r>
+              <w:rPr>
+                <w:rFonts w:ascii="Arial" w:hAnsi="Arial" w:cs="Arial"/>
+                <w:sz w:val="22"/>
+                <w:szCs w:val="22"/>
+              </w:rPr>
+              <w:t xml:space="preserve">ACRS</w:t>
+            </w:r>
+            <w:r>
+              <w:rPr>
+                <w:rFonts w:ascii="Arial" w:hAnsi="Arial" w:cs="Arial"/>
+                <w:sz w:val="22"/>
+                <w:szCs w:val="22"/>
+                <w:rtl/>
+              </w:rPr>
+              <w:t xml:space="preserve"> (خطورة التنبيه، وأهمية الجهاز، والخدمات التي تعتمد عليه) متوفرة عادةً لدى فرق الأمن في أدوات إدارة الأصول وأنظمة الكشف والتنبيهات التي تطلبها الضوابط الأساسية للأمن السيبراني </w:t>
+            </w:r>
+            <w:r>
+              <w:rPr>
+                <w:rFonts w:ascii="Arial" w:hAnsi="Arial" w:cs="Arial"/>
+                <w:sz w:val="22"/>
+                <w:szCs w:val="22"/>
+              </w:rPr>
+              <w:t xml:space="preserve">[7]</w:t>
+            </w:r>
+            <w:r>
+              <w:rPr>
+                <w:rFonts w:ascii="Arial" w:hAnsi="Arial" w:cs="Arial"/>
+                <w:sz w:val="22"/>
+                <w:szCs w:val="22"/>
+                <w:rtl/>
+              </w:rPr>
+              <w:t xml:space="preserve">.</w:t>
+            </w:r>
+          </w:p>
+          <w:p>
+            <w:pPr>
+              <w:bidi/>
+              <w:spacing w:after="100" w:line="300" w:lineRule="auto"/>
+              <w:jc w:val="both"/>
+              <w:rPr>
+                <w:rFonts w:ascii="Arial" w:hAnsi="Arial" w:cs="Arial"/>
+                <w:sz w:val="22"/>
+                <w:szCs w:val="22"/>
+                <w:rtl/>
+              </w:rPr>
+            </w:pPr>
+            <w:r>
+              <w:rPr>
+                <w:rFonts w:ascii="Arial" w:hAnsi="Arial" w:cs="Arial"/>
+                <w:b/>
+                <w:bCs/>
+                <w:sz w:val="22"/>
+                <w:szCs w:val="22"/>
+                <w:rtl/>
+              </w:rPr>
               <w:t xml:space="preserve">سؤال البحث:</w:t>
             </w:r>
             <w:r>
@@ -6383,7 +6517,7 @@
                 <w:szCs w:val="22"/>
                 <w:rtl/>
               </w:rPr>
-              <w:t xml:space="preserve">، ونحن ننشر ما تحقق وما لم يتحقق.</w:t>
+              <w:t xml:space="preserve">. وتُقبل الفرضية إذا تحقق رقمها المسجل على بيانات جديدة لم يُصمَّم عليها النظام، وتُرفض إذا لم يتحقق، وننشر الحالتين.</w:t>
             </w:r>
           </w:p>
         </w:tc>
@@ -7068,7 +7202,41 @@
                 <w:szCs w:val="22"/>
                 <w:rtl/>
               </w:rPr>
-              <w:t xml:space="preserve">.</w:t>
+              <w:t xml:space="preserve"> على مسألة من </w:t>
+            </w:r>
+            <w:r>
+              <w:rPr>
+                <w:rFonts w:ascii="Arial" w:hAnsi="Arial" w:cs="Arial"/>
+                <w:sz w:val="22"/>
+                <w:szCs w:val="22"/>
+              </w:rPr>
+              <w:t xml:space="preserve">110</w:t>
+            </w:r>
+            <w:r>
+              <w:rPr>
+                <w:rFonts w:ascii="Arial" w:hAnsi="Arial" w:cs="Arial"/>
+                <w:sz w:val="22"/>
+                <w:szCs w:val="22"/>
+                <w:rtl/>
+              </w:rPr>
+              <w:t xml:space="preserve"> كيوبت، وأكبر مسائلنا بعد التقسيم </w:t>
+            </w:r>
+            <w:r>
+              <w:rPr>
+                <w:rFonts w:ascii="Arial" w:hAnsi="Arial" w:cs="Arial"/>
+                <w:sz w:val="22"/>
+                <w:szCs w:val="22"/>
+              </w:rPr>
+              <w:t xml:space="preserve">16</w:t>
+            </w:r>
+            <w:r>
+              <w:rPr>
+                <w:rFonts w:ascii="Arial" w:hAnsi="Arial" w:cs="Arial"/>
+                <w:sz w:val="22"/>
+                <w:szCs w:val="22"/>
+                <w:rtl/>
+              </w:rPr>
+              <w:t xml:space="preserve"> كيوبت.</w:t>
             </w:r>
           </w:p>
           <w:p>
@@ -12984,7 +13152,7 @@
                 <w:sz w:val="22"/>
                 <w:szCs w:val="22"/>
               </w:rPr>
-              <w:t xml:space="preserve">6</w:t>
+              <w:t xml:space="preserve">6 (v12)</w:t>
             </w:r>
             <w:r>
               <w:rPr>
@@ -13010,7 +13178,7 @@
                 <w:szCs w:val="22"/>
                 <w:rtl/>
               </w:rPr>
-              <w:t xml:space="preserve"> بعدها (</w:t>
+              <w:t xml:space="preserve"> بعدها على </w:t>
             </w:r>
             <w:r>
               <w:rPr>
@@ -13027,7 +13195,7 @@
                 <w:szCs w:val="22"/>
                 <w:rtl/>
               </w:rPr>
-              <w:t xml:space="preserve"> سلسلة جديدة).</w:t>
+              <w:t xml:space="preserve"> سلسلة جديدة.</w:t>
             </w:r>
           </w:p>
           <w:p>
@@ -16806,7 +16974,7 @@
                       <w:szCs w:val="19"/>
                       <w:rtl/>
                     </w:rPr>
-                    <w:t xml:space="preserve">، مستشعر شبكة مستقل)</w:t>
+                    <w:t xml:space="preserve">، مستشعر شبكة برمجي مستقل)</w:t>
                   </w:r>
                 </w:p>
               </w:tc>
@@ -20089,7 +20257,24 @@
                 <w:sz w:val="22"/>
                 <w:szCs w:val="22"/>
               </w:rPr>
-              <w:t xml:space="preserve">31%)</w:t>
+              <w:t xml:space="preserve">31%</w:t>
+            </w:r>
+            <w:r>
+              <w:rPr>
+                <w:rFonts w:ascii="Arial" w:hAnsi="Arial" w:cs="Arial"/>
+                <w:sz w:val="22"/>
+                <w:szCs w:val="22"/>
+                <w:rtl/>
+              </w:rPr>
+              <w:t xml:space="preserve"> مقابل هدف </w:t>
+            </w:r>
+            <w:r>
+              <w:rPr>
+                <w:rFonts w:ascii="Arial" w:hAnsi="Arial" w:cs="Arial"/>
+                <w:sz w:val="22"/>
+                <w:szCs w:val="22"/>
+              </w:rPr>
+              <w:t xml:space="preserve">80%)</w:t>
             </w:r>
             <w:r>
               <w:rPr>
@@ -20965,7 +21150,7 @@
                 <w:szCs w:val="22"/>
                 <w:rtl/>
               </w:rPr>
-              <w:t xml:space="preserve"> كانت أول إشارة هي رسالة الفدية نفسها، ولا شيء يُحتوى بدون كشف. وكاشف التزوير يعتمد على مستشعر شبكة مستقل لا يتحكم به المهاجم.</w:t>
+              <w:t xml:space="preserve"> كانت أول إشارة هي رسالة الفدية نفسها، ولا شيء يُحتوى بدون كشف. وكاشف التزوير يعتمد على مستشعر شبكة برمجي مستقل لا يتحكم به المهاجم.</w:t>
             </w:r>
           </w:p>
           <w:p>
@@ -22562,7 +22747,7 @@
                       <w:szCs w:val="19"/>
                       <w:rtl/>
                     </w:rPr>
-                    <w:t xml:space="preserve">حاسوب شخصي</w:t>
+                    <w:t xml:space="preserve">حاسوب شخصي (المنزل)</w:t>
                   </w:r>
                 </w:p>
               </w:tc>
@@ -22766,7 +22951,7 @@
                       <w:szCs w:val="19"/>
                       <w:rtl/>
                     </w:rPr>
-                    <w:t xml:space="preserve">حاسوب شخصي</w:t>
+                    <w:t xml:space="preserve">حاسوب شخصي (المنزل)</w:t>
                   </w:r>
                 </w:p>
               </w:tc>
@@ -24592,7 +24777,7 @@
                 <w:szCs w:val="22"/>
                 <w:rtl/>
               </w:rPr>
-              <w:t xml:space="preserve"> استُخدم أداةً مساعدة لا أداةً رئيسية، وأن </w:t>
+              <w:t xml:space="preserve"> استُخدم أداةً مساعدة، وأن </w:t>
             </w:r>
             <w:r>
               <w:rPr>
@@ -24793,7 +24978,24 @@
                 <w:szCs w:val="22"/>
                 <w:rtl/>
               </w:rPr>
-              <w:t xml:space="preserve"> من هذا النموذج.</w:t>
+              <w:t xml:space="preserve"> من هذا النموذج (وأكمل </w:t>
+            </w:r>
+            <w:r>
+              <w:rPr>
+                <w:rFonts w:ascii="Arial" w:hAnsi="Arial" w:cs="Arial"/>
+                <w:sz w:val="22"/>
+                <w:szCs w:val="22"/>
+              </w:rPr>
+              <w:t xml:space="preserve">Claude</w:t>
+            </w:r>
+            <w:r>
+              <w:rPr>
+                <w:rFonts w:ascii="Arial" w:hAnsi="Arial" w:cs="Arial"/>
+                <w:sz w:val="22"/>
+                <w:szCs w:val="22"/>
+                <w:rtl/>
+              </w:rPr>
+              <w:t xml:space="preserve"> جملًا قليلة فيها من بيانات المشروع، كقابلية المعالجة، وراجعها الطالب).</w:t>
             </w:r>
           </w:p>
           <w:p>

</xml_diff>

<commit_message>
form v18: abstract adds generalization (bank/university/factory), Linux 6,002 checks, ECC relevance (381/400 words)
Co-Authored-By: Claude Opus 5.5 <noreply@anthropic.com>
Claude-Session: https://claude.ai/code/session_011J2KrGUp2npQo9Tosx1KRc
</commit_message>
<xml_diff>
--- a/docs/qacrs/form_drafts/IBDAA_2027_FORM_ACRS_v18.docx
+++ b/docs/qacrs/form_drafts/IBDAA_2027_FORM_ACRS_v18.docx
@@ -3284,7 +3284,92 @@
                 <w:szCs w:val="22"/>
                 <w:rtl/>
               </w:rPr>
-              <w:t xml:space="preserve"> أجهزة إجبار النظام على إيقاف أي خدمة.</w:t>
+              <w:t xml:space="preserve"> أجهزة إجبار النظام على إيقاف أي خدمة. وبالمحرّك نفسه دون تغيير أي وزن تحقق هدف الاحتواء في شبكة بنك (</w:t>
+            </w:r>
+            <w:r>
+              <w:rPr>
+                <w:rFonts w:ascii="Arial" w:hAnsi="Arial" w:cs="Arial"/>
+                <w:sz w:val="22"/>
+                <w:szCs w:val="22"/>
+              </w:rPr>
+              <w:t xml:space="preserve">0.902)</w:t>
+            </w:r>
+            <w:r>
+              <w:rPr>
+                <w:rFonts w:ascii="Arial" w:hAnsi="Arial" w:cs="Arial"/>
+                <w:sz w:val="22"/>
+                <w:szCs w:val="22"/>
+                <w:rtl/>
+              </w:rPr>
+              <w:t xml:space="preserve"> وجامعة (</w:t>
+            </w:r>
+            <w:r>
+              <w:rPr>
+                <w:rFonts w:ascii="Arial" w:hAnsi="Arial" w:cs="Arial"/>
+                <w:sz w:val="22"/>
+                <w:szCs w:val="22"/>
+              </w:rPr>
+              <w:t xml:space="preserve">0.839)</w:t>
+            </w:r>
+            <w:r>
+              <w:rPr>
+                <w:rFonts w:ascii="Arial" w:hAnsi="Arial" w:cs="Arial"/>
+                <w:sz w:val="22"/>
+                <w:szCs w:val="22"/>
+                <w:rtl/>
+              </w:rPr>
+              <w:t xml:space="preserve">، وكان أقل قليلًا في مصنع (</w:t>
+            </w:r>
+            <w:r>
+              <w:rPr>
+                <w:rFonts w:ascii="Arial" w:hAnsi="Arial" w:cs="Arial"/>
+                <w:sz w:val="22"/>
+                <w:szCs w:val="22"/>
+              </w:rPr>
+              <w:t xml:space="preserve">0.792)</w:t>
+            </w:r>
+            <w:r>
+              <w:rPr>
+                <w:rFonts w:ascii="Arial" w:hAnsi="Arial" w:cs="Arial"/>
+                <w:sz w:val="22"/>
+                <w:szCs w:val="22"/>
+                <w:rtl/>
+              </w:rPr>
+              <w:t xml:space="preserve">، وطابق جدار حماية </w:t>
+            </w:r>
+            <w:r>
+              <w:rPr>
+                <w:rFonts w:ascii="Arial" w:hAnsi="Arial" w:cs="Arial"/>
+                <w:sz w:val="22"/>
+                <w:szCs w:val="22"/>
+              </w:rPr>
+              <w:t xml:space="preserve">Linux</w:t>
+            </w:r>
+            <w:r>
+              <w:rPr>
+                <w:rFonts w:ascii="Arial" w:hAnsi="Arial" w:cs="Arial"/>
+                <w:sz w:val="22"/>
+                <w:szCs w:val="22"/>
+                <w:rtl/>
+              </w:rPr>
+              <w:t xml:space="preserve"> حقيقي النموذج في </w:t>
+            </w:r>
+            <w:r>
+              <w:rPr>
+                <w:rFonts w:ascii="Arial" w:hAnsi="Arial" w:cs="Arial"/>
+                <w:sz w:val="22"/>
+                <w:szCs w:val="22"/>
+              </w:rPr>
+              <w:t xml:space="preserve">6,002</w:t>
+            </w:r>
+            <w:r>
+              <w:rPr>
+                <w:rFonts w:ascii="Arial" w:hAnsi="Arial" w:cs="Arial"/>
+                <w:sz w:val="22"/>
+                <w:szCs w:val="22"/>
+                <w:rtl/>
+              </w:rPr>
+              <w:t xml:space="preserve"> فحص.</w:t>
             </w:r>
           </w:p>
           <w:p>
@@ -3391,7 +3476,24 @@
                 <w:szCs w:val="22"/>
                 <w:rtl/>
               </w:rPr>
-              <w:t xml:space="preserve"> جهازًا. والحاسوب الكمّي أبطأ اليوم ولم ندّعِ تفوقًا كمّيًا، وأضفناه لأن مسألتنا بالشكل نفسه الذي يحله. وكانت الحوادث الحقيقية مُعاد بناؤها من تقارير عامة، وأشارت النتائج إلى أن الأنظمة يمكن أن تحتوي الهجوم مع استمرار الخدمة متى وصل التنبيه.</w:t>
+              <w:t xml:space="preserve"> جهازًا. والحاسوب الكمّي أبطأ اليوم ولم ندّعِ تفوقًا كمّيًا، وأضفناه لأن مسألتنا بالشكل نفسه الذي يحله. وكانت الحوادث الحقيقية مُعاد بناؤها من تقارير عامة، وأشارت النتائج إلى أن الأنظمة يمكن أن تحتوي الهجوم مع استمرار الخدمة متى وصل التنبيه، وهو ما تطلبه الضوابط الأساسية للأمن السيبراني في المملكة من صمود أثناء الحوادث </w:t>
+            </w:r>
+            <w:r>
+              <w:rPr>
+                <w:rFonts w:ascii="Arial" w:hAnsi="Arial" w:cs="Arial"/>
+                <w:sz w:val="22"/>
+                <w:szCs w:val="22"/>
+              </w:rPr>
+              <w:t xml:space="preserve">[4]</w:t>
+            </w:r>
+            <w:r>
+              <w:rPr>
+                <w:rFonts w:ascii="Arial" w:hAnsi="Arial" w:cs="Arial"/>
+                <w:sz w:val="22"/>
+                <w:szCs w:val="22"/>
+                <w:rtl/>
+              </w:rPr>
+              <w:t xml:space="preserve">.</w:t>
             </w:r>
           </w:p>
         </w:tc>
@@ -4052,7 +4154,7 @@
                 <w:sz w:val="22"/>
                 <w:szCs w:val="22"/>
               </w:rPr>
-              <w:t xml:space="preserve">[4]</w:t>
+              <w:t xml:space="preserve">[5]</w:t>
             </w:r>
             <w:r>
               <w:rPr>
@@ -4153,7 +4255,7 @@
                 <w:sz w:val="22"/>
                 <w:szCs w:val="22"/>
               </w:rPr>
-              <w:t xml:space="preserve">[5]</w:t>
+              <w:t xml:space="preserve">[6]</w:t>
             </w:r>
             <w:r>
               <w:rPr>
@@ -4187,7 +4289,7 @@
                 <w:sz w:val="22"/>
                 <w:szCs w:val="22"/>
               </w:rPr>
-              <w:t xml:space="preserve">[6]</w:t>
+              <w:t xml:space="preserve">[7]</w:t>
             </w:r>
             <w:r>
               <w:rPr>
@@ -4221,7 +4323,7 @@
                 <w:sz w:val="22"/>
                 <w:szCs w:val="22"/>
               </w:rPr>
-              <w:t xml:space="preserve">[7]</w:t>
+              <w:t xml:space="preserve">[4]</w:t>
             </w:r>
             <w:r>
               <w:rPr>
@@ -4422,7 +4524,7 @@
                 <w:sz w:val="22"/>
                 <w:szCs w:val="22"/>
               </w:rPr>
-              <w:t xml:space="preserve">[7]</w:t>
+              <w:t xml:space="preserve">[4]</w:t>
             </w:r>
             <w:r>
               <w:rPr>
@@ -21623,7 +21725,7 @@
                 <w:sz w:val="22"/>
                 <w:szCs w:val="22"/>
               </w:rPr>
-              <w:t xml:space="preserve">ECC-2:2024 [7]</w:t>
+              <w:t xml:space="preserve">ECC-2:2024 [4]</w:t>
             </w:r>
             <w:r>
               <w:rPr>
@@ -24129,18 +24231,58 @@
           </w:p>
           <w:p>
             <w:pPr>
-              <w:bidi w:val="0"/>
-              <w:spacing w:after="50" w:line="276" w:lineRule="auto"/>
-              <w:ind w:left="520" w:hanging="520"/>
-              <w:jc w:val="left"/>
-            </w:pPr>
-            <w:r>
+              <w:bidi/>
+              <w:spacing w:after="50" w:line="300" w:lineRule="auto"/>
+              <w:ind w:start="520" w:hanging="520"/>
+              <w:jc w:val="start"/>
               <w:rPr>
                 <w:rFonts w:ascii="Arial" w:hAnsi="Arial" w:cs="Arial"/>
                 <w:sz w:val="19"/>
                 <w:szCs w:val="19"/>
-              </w:rPr>
-              <w:t xml:space="preserve">[4]  U.S. Department of Energy, Office of Cybersecurity, Energy Security, and Emergency Response. (2021). Colonial Pipeline Cyber Incident. https://www.energy.gov/ceser/colonial-pipeline-cyber-incident</w:t>
+                <w:rtl/>
+              </w:rPr>
+            </w:pPr>
+            <w:r>
+              <w:rPr>
+                <w:rFonts w:ascii="Arial" w:hAnsi="Arial" w:cs="Arial"/>
+                <w:sz w:val="19"/>
+                <w:szCs w:val="19"/>
+              </w:rPr>
+              <w:t xml:space="preserve">[4]</w:t>
+            </w:r>
+            <w:r>
+              <w:rPr>
+                <w:rFonts w:ascii="Arial" w:hAnsi="Arial" w:cs="Arial"/>
+                <w:sz w:val="19"/>
+                <w:szCs w:val="19"/>
+                <w:rtl/>
+              </w:rPr>
+              <w:t xml:space="preserve">  الهيئة الوطنية للأمن السيبراني. (</w:t>
+            </w:r>
+            <w:r>
+              <w:rPr>
+                <w:rFonts w:ascii="Arial" w:hAnsi="Arial" w:cs="Arial"/>
+                <w:sz w:val="19"/>
+                <w:szCs w:val="19"/>
+              </w:rPr>
+              <w:t xml:space="preserve">2024)</w:t>
+            </w:r>
+            <w:r>
+              <w:rPr>
+                <w:rFonts w:ascii="Arial" w:hAnsi="Arial" w:cs="Arial"/>
+                <w:sz w:val="19"/>
+                <w:szCs w:val="19"/>
+                <w:rtl/>
+              </w:rPr>
+              <w:t xml:space="preserve">. الضوابط الأساسية للأمن السيبراني (</w:t>
+            </w:r>
+            <w:r>
+              <w:rPr>
+                <w:rFonts w:ascii="Arial" w:hAnsi="Arial" w:cs="Arial"/>
+                <w:sz w:val="19"/>
+                <w:szCs w:val="19"/>
+              </w:rPr>
+              <w:t xml:space="preserve">ECC-2:2024). https://cdn.nca.gov.sa/api/files/public/upload/86e09090-44e4-481f-bc28-355673607654_ECC--2024-EN.pdf</w:t>
             </w:r>
           </w:p>
           <w:p>
@@ -24156,7 +24298,7 @@
                 <w:sz w:val="19"/>
                 <w:szCs w:val="19"/>
               </w:rPr>
-              <w:t xml:space="preserve">[5]  NATO CCDCOE. (n.d.). Shamoon (2012). International Cyber Law: Interactive Toolkit. Retrieved October 23, 2026, from https://cyberlaw.ccdcoe.org/wiki/Shamoon_(2012)</w:t>
+              <w:t xml:space="preserve">[5]  U.S. Department of Energy, Office of Cybersecurity, Energy Security, and Emergency Response. (2021). Colonial Pipeline Cyber Incident. https://www.energy.gov/ceser/colonial-pipeline-cyber-incident</w:t>
             </w:r>
           </w:p>
           <w:p>
@@ -24172,63 +24314,23 @@
                 <w:sz w:val="19"/>
                 <w:szCs w:val="19"/>
               </w:rPr>
-              <w:t xml:space="preserve">[6]  Federal Bureau of Investigation. (2022, March 24). TRITON malware remains threat to global critical infrastructure industrial control systems (ICS) [Private Industry Notification]. https://www.ic3.gov/CSA/2022/220325.pdf</w:t>
+              <w:t xml:space="preserve">[6]  NATO CCDCOE. (n.d.). Shamoon (2012). International Cyber Law: Interactive Toolkit. Retrieved October 23, 2026, from https://cyberlaw.ccdcoe.org/wiki/Shamoon_(2012)</w:t>
             </w:r>
           </w:p>
           <w:p>
             <w:pPr>
-              <w:bidi/>
-              <w:spacing w:after="50" w:line="300" w:lineRule="auto"/>
-              <w:ind w:start="520" w:hanging="520"/>
-              <w:jc w:val="start"/>
+              <w:bidi w:val="0"/>
+              <w:spacing w:after="50" w:line="276" w:lineRule="auto"/>
+              <w:ind w:left="520" w:hanging="520"/>
+              <w:jc w:val="left"/>
+            </w:pPr>
+            <w:r>
               <w:rPr>
                 <w:rFonts w:ascii="Arial" w:hAnsi="Arial" w:cs="Arial"/>
                 <w:sz w:val="19"/>
                 <w:szCs w:val="19"/>
-                <w:rtl/>
-              </w:rPr>
-            </w:pPr>
-            <w:r>
-              <w:rPr>
-                <w:rFonts w:ascii="Arial" w:hAnsi="Arial" w:cs="Arial"/>
-                <w:sz w:val="19"/>
-                <w:szCs w:val="19"/>
-              </w:rPr>
-              <w:t xml:space="preserve">[7]</w:t>
-            </w:r>
-            <w:r>
-              <w:rPr>
-                <w:rFonts w:ascii="Arial" w:hAnsi="Arial" w:cs="Arial"/>
-                <w:sz w:val="19"/>
-                <w:szCs w:val="19"/>
-                <w:rtl/>
-              </w:rPr>
-              <w:t xml:space="preserve">  الهيئة الوطنية للأمن السيبراني. (</w:t>
-            </w:r>
-            <w:r>
-              <w:rPr>
-                <w:rFonts w:ascii="Arial" w:hAnsi="Arial" w:cs="Arial"/>
-                <w:sz w:val="19"/>
-                <w:szCs w:val="19"/>
-              </w:rPr>
-              <w:t xml:space="preserve">2024)</w:t>
-            </w:r>
-            <w:r>
-              <w:rPr>
-                <w:rFonts w:ascii="Arial" w:hAnsi="Arial" w:cs="Arial"/>
-                <w:sz w:val="19"/>
-                <w:szCs w:val="19"/>
-                <w:rtl/>
-              </w:rPr>
-              <w:t xml:space="preserve">. الضوابط الأساسية للأمن السيبراني (</w:t>
-            </w:r>
-            <w:r>
-              <w:rPr>
-                <w:rFonts w:ascii="Arial" w:hAnsi="Arial" w:cs="Arial"/>
-                <w:sz w:val="19"/>
-                <w:szCs w:val="19"/>
-              </w:rPr>
-              <w:t xml:space="preserve">ECC-2:2024). https://cdn.nca.gov.sa/api/files/public/upload/86e09090-44e4-481f-bc28-355673607654_ECC--2024-EN.pdf</w:t>
+              </w:rPr>
+              <w:t xml:space="preserve">[7]  Federal Bureau of Investigation. (2022, March 24). TRITON malware remains threat to global critical infrastructure industrial control systems (ICS) [Private Industry Notification]. https://www.ic3.gov/CSA/2022/220325.pdf</w:t>
             </w:r>
           </w:p>
           <w:p>

</xml_diff>